<commit_message>
feat(mau-11-13): Mẫu 11 đủ cột (5)–(7) — mức đề xuất đã ghi nhận ở bước tập thể, thẩm định, cấp trực tiếp; Mẫu 11, 13 chia mục I/II theo thẩm quyền, mục không có cán bộ thì không in như bảng tính Công ty; chức vụ in theo thứ tự Đảng, chính quyền, đoàn thể
</commit_message>
<xml_diff>
--- a/backend/src/CongTacDang.Infrastructure/Templates/Word/Mau_11_PhieuBoPhieuChiBo.docx
+++ b/backend/src/CongTacDang.Infrastructure/Templates/Word/Mau_11_PhieuBoPhieuChiBo.docx
@@ -1189,313 +1189,11 @@
           </w:p>
         </w:tc>
       </w:tr>
-      <w:tr>
-        <w:tc>
-          <w:tcPr>
-            <w:tcW w:w="450" w:type="dxa"/>
-          </w:tcPr>
-          <w:p>
-            <w:pPr>
-              <w:jc w:val="center"/>
-              <w:rPr>
-                <w:b/>
-                <w:bCs/>
-                <w:sz w:val="20"/>
-                <w:szCs w:val="20"/>
-              </w:rPr>
-            </w:pPr>
-            <w:r>
-              <w:rPr>
-                <w:b/>
-                <w:bCs/>
-                <w:sz w:val="20"/>
-                <w:szCs w:val="20"/>
-              </w:rPr>
-              <w:t>I</w:t>
-            </w:r>
-          </w:p>
-        </w:tc>
-        <w:tc>
-          <w:tcPr>
-            <w:tcW w:w="14133" w:type="dxa"/>
-            <w:gridSpan w:val="13"/>
-          </w:tcPr>
-          <w:p>
-            <w:pPr>
-              <w:rPr>
-                <w:b/>
-                <w:bCs/>
-                <w:sz w:val="20"/>
-                <w:szCs w:val="20"/>
-              </w:rPr>
-            </w:pPr>
-            <w:r>
-              <w:rPr>
-                <w:b/>
-                <w:bCs/>
-                <w:sz w:val="20"/>
-                <w:szCs w:val="20"/>
-              </w:rPr>
-              <w:t>DANH SÁCH CÁN BỘ THUỘC THẨM QUYỀN QUYẾT ĐỊNH, PHÊ DUYỆT MỨC XẾP LOẠI CỦA BAN THƯỜNG VỤ ĐẢNG ỦY TCT</w:t>
-            </w:r>
-          </w:p>
-        </w:tc>
-      </w:tr>
-      <w:tr>
-        <w:tc>
-          <w:tcPr>
-            <w:tcW w:w="450" w:type="dxa"/>
-          </w:tcPr>
-          <w:p>
-            <w:pPr>
-              <w:jc w:val="center"/>
-              <w:rPr>
-                <w:sz w:val="20"/>
-                <w:szCs w:val="20"/>
-              </w:rPr>
-            </w:pPr>
-          </w:p>
-        </w:tc>
-        <w:tc>
-          <w:tcPr>
-            <w:tcW w:w="1435" w:type="dxa"/>
-          </w:tcPr>
-          <w:p>
-            <w:pPr>
-              <w:rPr>
-                <w:sz w:val="20"/>
-                <w:szCs w:val="20"/>
-              </w:rPr>
-            </w:pPr>
-          </w:p>
-        </w:tc>
-        <w:tc>
-          <w:tcPr>
-            <w:tcW w:w="1719" w:type="dxa"/>
-          </w:tcPr>
-          <w:p>
-            <w:pPr>
-              <w:rPr>
-                <w:sz w:val="20"/>
-                <w:szCs w:val="20"/>
-              </w:rPr>
-            </w:pPr>
-          </w:p>
-        </w:tc>
-        <w:tc>
-          <w:tcPr>
-            <w:tcW w:w="871" w:type="dxa"/>
-          </w:tcPr>
-          <w:p>
-            <w:pPr>
-              <w:jc w:val="center"/>
-              <w:rPr>
-                <w:sz w:val="20"/>
-                <w:szCs w:val="20"/>
-              </w:rPr>
-            </w:pPr>
-          </w:p>
-        </w:tc>
-        <w:tc>
-          <w:tcPr>
-            <w:tcW w:w="1324" w:type="dxa"/>
-          </w:tcPr>
-          <w:p>
-            <w:pPr>
-              <w:jc w:val="center"/>
-              <w:rPr>
-                <w:sz w:val="20"/>
-                <w:szCs w:val="20"/>
-              </w:rPr>
-            </w:pPr>
-          </w:p>
-        </w:tc>
-        <w:tc>
-          <w:tcPr>
-            <w:tcW w:w="774" w:type="dxa"/>
-          </w:tcPr>
-          <w:p>
-            <w:pPr>
-              <w:jc w:val="center"/>
-              <w:rPr>
-                <w:sz w:val="20"/>
-                <w:szCs w:val="20"/>
-              </w:rPr>
-            </w:pPr>
-          </w:p>
-        </w:tc>
-        <w:tc>
-          <w:tcPr>
-            <w:tcW w:w="728" w:type="dxa"/>
-          </w:tcPr>
-          <w:p>
-            <w:pPr>
-              <w:jc w:val="center"/>
-              <w:rPr>
-                <w:sz w:val="20"/>
-                <w:szCs w:val="20"/>
-              </w:rPr>
-            </w:pPr>
-          </w:p>
-        </w:tc>
-        <w:tc>
-          <w:tcPr>
-            <w:tcW w:w="2050" w:type="dxa"/>
-          </w:tcPr>
-          <w:p>
-            <w:pPr>
-              <w:jc w:val="center"/>
-              <w:rPr>
-                <w:sz w:val="20"/>
-                <w:szCs w:val="20"/>
-              </w:rPr>
-            </w:pPr>
-          </w:p>
-        </w:tc>
-        <w:tc>
-          <w:tcPr>
-            <w:tcW w:w="1276" w:type="dxa"/>
-          </w:tcPr>
-          <w:p>
-            <w:pPr>
-              <w:jc w:val="center"/>
-              <w:rPr>
-                <w:i/>
-                <w:iCs/>
-                <w:sz w:val="20"/>
-                <w:szCs w:val="20"/>
-              </w:rPr>
-            </w:pPr>
-          </w:p>
-        </w:tc>
-        <w:tc>
-          <w:tcPr>
-            <w:tcW w:w="898" w:type="dxa"/>
-          </w:tcPr>
-          <w:p>
-            <w:pPr>
-              <w:jc w:val="center"/>
-              <w:rPr>
-                <w:sz w:val="20"/>
-                <w:szCs w:val="20"/>
-              </w:rPr>
-            </w:pPr>
-          </w:p>
-        </w:tc>
-        <w:tc>
-          <w:tcPr>
-            <w:tcW w:w="738" w:type="dxa"/>
-          </w:tcPr>
-          <w:p>
-            <w:pPr>
-              <w:jc w:val="center"/>
-              <w:rPr>
-                <w:sz w:val="20"/>
-                <w:szCs w:val="20"/>
-              </w:rPr>
-            </w:pPr>
-          </w:p>
-        </w:tc>
-        <w:tc>
-          <w:tcPr>
-            <w:tcW w:w="705" w:type="dxa"/>
-          </w:tcPr>
-          <w:p>
-            <w:pPr>
-              <w:jc w:val="center"/>
-              <w:rPr>
-                <w:sz w:val="20"/>
-                <w:szCs w:val="20"/>
-              </w:rPr>
-            </w:pPr>
-          </w:p>
-        </w:tc>
-        <w:tc>
-          <w:tcPr>
-            <w:tcW w:w="808" w:type="dxa"/>
-          </w:tcPr>
-          <w:p>
-            <w:pPr>
-              <w:jc w:val="center"/>
-              <w:rPr>
-                <w:sz w:val="20"/>
-                <w:szCs w:val="20"/>
-              </w:rPr>
-            </w:pPr>
-          </w:p>
-        </w:tc>
-        <w:tc>
-          <w:tcPr>
-            <w:tcW w:w="806" w:type="dxa"/>
-          </w:tcPr>
-          <w:p>
-            <w:pPr>
-              <w:jc w:val="center"/>
-              <w:rPr>
-                <w:sz w:val="20"/>
-                <w:szCs w:val="20"/>
-              </w:rPr>
-            </w:pPr>
-          </w:p>
-        </w:tc>
-      </w:tr>
-      <w:tr>
-        <w:tc>
-          <w:tcPr>
-            <w:tcW w:w="450" w:type="dxa"/>
-          </w:tcPr>
-          <w:p>
-            <w:pPr>
-              <w:jc w:val="center"/>
-              <w:rPr>
-                <w:b/>
-                <w:bCs/>
-                <w:sz w:val="20"/>
-                <w:szCs w:val="20"/>
-              </w:rPr>
-            </w:pPr>
-            <w:r>
-              <w:rPr>
-                <w:b/>
-                <w:bCs/>
-                <w:sz w:val="20"/>
-                <w:szCs w:val="20"/>
-              </w:rPr>
-              <w:t>II</w:t>
-            </w:r>
-          </w:p>
-        </w:tc>
-        <w:tc>
-          <w:tcPr>
-            <w:tcW w:w="14133" w:type="dxa"/>
-            <w:gridSpan w:val="13"/>
-          </w:tcPr>
-          <w:p>
-            <w:pPr>
-              <w:rPr>
-                <w:b/>
-                <w:bCs/>
-                <w:sz w:val="20"/>
-                <w:szCs w:val="20"/>
-              </w:rPr>
-            </w:pPr>
-            <w:r>
-              <w:rPr>
-                <w:b/>
-                <w:bCs/>
-                <w:sz w:val="20"/>
-                <w:szCs w:val="20"/>
-              </w:rPr>
-              <w:t>DANH SÁCH CÁN BỘ THUỘC THẨM QUYỀN QUYẾT ĐỊNH, PHÊ DUYỆT MỨC XẾP LOẠI CỦA ĐẢNG ỦY/CHI ỦY CƠ SỞ…</w:t>
-            </w:r>
-          </w:p>
-        </w:tc>
-      </w:tr>
       <w:sdt>
         <w:sdtPr>
-          <w:alias w:val="repeat:RECORDS"/>
-          <w:tag w:val="repeat:RECORDS"/>
-          <w:id w:val="510065"/>
+          <w:alias w:val="if:SHOW_SUPERIOR"/>
+          <w:tag w:val="if:SHOW_SUPERIOR"/>
+          <w:id w:val="921008"/>
         </w:sdtPr>
         <w:sdtContent>
           <w:tr>
@@ -1504,259 +1202,1135 @@
                 <w:tcW w:w="450" w:type="dxa"/>
               </w:tcPr>
               <w:p>
-                <w:sdt>
-                  <w:sdtPr>
-                    <w:alias w:val="R_STT"/>
-                    <w:tag w:val="R_STT"/>
-                    <w:id w:val="510059"/>
-                  </w:sdtPr>
-                  <w:sdtContent>
+                <w:pPr>
+                  <w:jc w:val="center"/>
+                  <w:rPr>
+                    <w:b/>
+                    <w:bCs/>
+                    <w:sz w:val="20"/>
+                    <w:szCs w:val="20"/>
+                  </w:rPr>
+                </w:pPr>
+                <w:r>
+                  <w:rPr>
+                    <w:b/>
+                    <w:bCs/>
+                    <w:sz w:val="20"/>
+                    <w:szCs w:val="20"/>
+                  </w:rPr>
+                  <w:t>I</w:t>
+                </w:r>
+              </w:p>
+            </w:tc>
+            <w:tc>
+              <w:tcPr>
+                <w:tcW w:w="14133" w:type="dxa"/>
+                <w:gridSpan w:val="13"/>
+              </w:tcPr>
+              <w:p>
+                <w:pPr>
+                  <w:rPr>
+                    <w:b/>
+                    <w:bCs/>
+                    <w:sz w:val="20"/>
+                    <w:szCs w:val="20"/>
+                  </w:rPr>
+                </w:pPr>
+                <w:r>
+                  <w:rPr>
+                    <w:b/>
+                    <w:bCs/>
+                    <w:sz w:val="20"/>
+                    <w:szCs w:val="20"/>
+                  </w:rPr>
+                  <w:t>DANH SÁCH CÁN BỘ THUỘC THẨM QUYỀN QUYẾT ĐỊNH, PHÊ DUYỆT MỨC XẾP LOẠI CỦA BAN THƯỜNG VỤ ĐẢNG ỦY TCT</w:t>
+                </w:r>
+              </w:p>
+            </w:tc>
+          </w:tr>
+          <w:sdt>
+            <w:sdtPr>
+              <w:alias w:val="repeat:SUPERIOR_ROWS"/>
+              <w:tag w:val="repeat:SUPERIOR_ROWS"/>
+              <w:id w:val="921004"/>
+            </w:sdtPr>
+            <w:sdtContent>
+              <w:tr>
+                <w:tc>
+                  <w:tcPr>
+                    <w:tcW w:w="450" w:type="dxa"/>
+                  </w:tcPr>
+                  <w:p>
+                    <w:sdt>
+                      <w:sdtPr>
+                        <w:alias w:val="R_STT"/>
+                        <w:tag w:val="R_STT"/>
+                        <w:id w:val="510059"/>
+                      </w:sdtPr>
+                      <w:sdtContent>
+                        <w:r>
+                          <w:rPr>
+                            <w:rFonts w:ascii="Times New Roman" w:hAnsi="Times New Roman"/>
+                            <w:sz w:val="20"/>
+                          </w:rPr>
+                          <w:t xml:space="preserve">«R_STT»</w:t>
+                        </w:r>
+                      </w:sdtContent>
+                    </w:sdt>
+                  </w:p>
+                </w:tc>
+                <w:tc>
+                  <w:tcPr>
+                    <w:tcW w:w="1435" w:type="dxa"/>
+                  </w:tcPr>
+                  <w:p>
+                    <w:sdt>
+                      <w:sdtPr>
+                        <w:alias w:val="R_NAME"/>
+                        <w:tag w:val="R_NAME"/>
+                        <w:id w:val="510060"/>
+                      </w:sdtPr>
+                      <w:sdtContent>
+                        <w:r>
+                          <w:rPr>
+                            <w:rFonts w:ascii="Times New Roman" w:hAnsi="Times New Roman"/>
+                            <w:sz w:val="20"/>
+                          </w:rPr>
+                          <w:t xml:space="preserve">«R_NAME»</w:t>
+                        </w:r>
+                      </w:sdtContent>
+                    </w:sdt>
+                  </w:p>
+                </w:tc>
+                <w:tc>
+                  <w:tcPr>
+                    <w:tcW w:w="1719" w:type="dxa"/>
+                  </w:tcPr>
+                  <w:p>
+                    <w:sdt>
+                      <w:sdtPr>
+                        <w:alias w:val="R_POSITION_DEPT"/>
+                        <w:tag w:val="R_POSITION_DEPT"/>
+                        <w:id w:val="510061"/>
+                      </w:sdtPr>
+                      <w:sdtContent>
+                        <w:r>
+                          <w:rPr>
+                            <w:rFonts w:ascii="Times New Roman" w:hAnsi="Times New Roman"/>
+                            <w:sz w:val="20"/>
+                          </w:rPr>
+                          <w:t xml:space="preserve">«R_POSITION_DEPT»</w:t>
+                        </w:r>
+                      </w:sdtContent>
+                    </w:sdt>
+                  </w:p>
+                </w:tc>
+                <w:tc>
+                  <w:tcPr>
+                    <w:tcW w:w="871" w:type="dxa"/>
+                  </w:tcPr>
+                  <w:p>
+                    <w:sdt>
+                      <w:sdtPr>
+                        <w:alias w:val="R_GENERAL_SCORE"/>
+                        <w:tag w:val="R_GENERAL_SCORE"/>
+                        <w:id w:val="510062"/>
+                      </w:sdtPr>
+                      <w:sdtContent>
+                        <w:r>
+                          <w:rPr>
+                            <w:rFonts w:ascii="Times New Roman" w:hAnsi="Times New Roman"/>
+                            <w:sz w:val="20"/>
+                          </w:rPr>
+                          <w:t xml:space="preserve">«R_GENERAL_SCORE»</w:t>
+                        </w:r>
+                      </w:sdtContent>
+                    </w:sdt>
+                  </w:p>
+                </w:tc>
+                <w:tc>
+                  <w:tcPr>
+                    <w:tcW w:w="1324" w:type="dxa"/>
+                  </w:tcPr>
+                  <w:p>
                     <w:r>
                       <w:rPr>
                         <w:rFonts w:ascii="Times New Roman" w:hAnsi="Times New Roman"/>
                         <w:sz w:val="20"/>
                       </w:rPr>
-                      <w:t xml:space="preserve">«R_STT»</w:t>
+                      <w:t/>
+                    </w:r>
+                    <w:sdt>
+                      <w:sdtPr>
+                        <w:alias w:val="R_TASKS_SCORE"/>
+                        <w:tag w:val="R_TASKS_SCORE"/>
+                        <w:id w:val="510064"/>
+                      </w:sdtPr>
+                      <w:sdtContent>
+                        <w:r>
+                          <w:rPr>
+                            <w:rFonts w:ascii="Times New Roman" w:hAnsi="Times New Roman"/>
+                            <w:sz w:val="20"/>
+                          </w:rPr>
+                          <w:t xml:space="preserve">«R_TASKS_SCORE»</w:t>
+                        </w:r>
+                      </w:sdtContent>
+                    </w:sdt>
+                  </w:p>
+                </w:tc>
+                <w:tc>
+                  <w:tcPr>
+                    <w:tcW w:w="774" w:type="dxa"/>
+                  </w:tcPr>
+                  <w:p>
+                    <w:sdt>
+                      <w:sdtPr>
+                        <w:alias w:val="R_SELF_GRADE"/>
+                        <w:tag w:val="R_SELF_GRADE"/>
+                        <w:id w:val="510063"/>
+                      </w:sdtPr>
+                      <w:sdtContent>
+                        <w:r>
+                          <w:rPr>
+                            <w:rFonts w:ascii="Times New Roman" w:hAnsi="Times New Roman"/>
+                            <w:sz w:val="20"/>
+                          </w:rPr>
+                          <w:t xml:space="preserve">«R_SELF_GRADE»</w:t>
+                        </w:r>
+                      </w:sdtContent>
+                    </w:sdt>
+                  </w:p>
+                </w:tc>
+                <w:tc>
+                  <w:tcPr>
+                    <w:tcW w:w="728" w:type="dxa"/>
+                  </w:tcPr>
+                  <w:p>
+                    <w:sdt>
+                      <w:sdtPr>
+                        <w:alias w:val="R_COLLECTIVE_GRADE"/>
+                        <w:tag w:val="R_COLLECTIVE_GRADE"/>
+                        <w:id w:val="921000"/>
+                      </w:sdtPr>
+                      <w:sdtContent>
+                        <w:r>
+                          <w:rPr>
+                            <w:rFonts w:ascii="Times New Roman" w:hAnsi="Times New Roman"/>
+                            <w:sz w:val="20"/>
+                          </w:rPr>
+                          <w:t xml:space="preserve"/>
+                        </w:r>
+                      </w:sdtContent>
+                    </w:sdt>
+                  </w:p>
+                </w:tc>
+                <w:tc>
+                  <w:tcPr>
+                    <w:tcW w:w="2050" w:type="dxa"/>
+                  </w:tcPr>
+                  <w:p>
+                    <w:sdt>
+                      <w:sdtPr>
+                        <w:alias w:val="R_APPRAISAL_GRADE"/>
+                        <w:tag w:val="R_APPRAISAL_GRADE"/>
+                        <w:id w:val="921001"/>
+                      </w:sdtPr>
+                      <w:sdtContent>
+                        <w:r>
+                          <w:rPr>
+                            <w:rFonts w:ascii="Times New Roman" w:hAnsi="Times New Roman"/>
+                            <w:sz w:val="20"/>
+                          </w:rPr>
+                          <w:t xml:space="preserve"/>
+                        </w:r>
+                      </w:sdtContent>
+                    </w:sdt>
+                  </w:p>
+                </w:tc>
+                <w:tc>
+                  <w:tcPr>
+                    <w:tcW w:w="1276" w:type="dxa"/>
+                  </w:tcPr>
+                  <w:p>
+                    <w:sdt>
+                      <w:sdtPr>
+                        <w:alias w:val="R_DIRECTOR_GRADE"/>
+                        <w:tag w:val="R_DIRECTOR_GRADE"/>
+                        <w:id w:val="921002"/>
+                      </w:sdtPr>
+                      <w:sdtContent>
+                        <w:r>
+                          <w:rPr>
+                            <w:rFonts w:ascii="Times New Roman" w:hAnsi="Times New Roman"/>
+                            <w:sz w:val="20"/>
+                          </w:rPr>
+                          <w:t xml:space="preserve"/>
+                        </w:r>
+                      </w:sdtContent>
+                    </w:sdt>
+                  </w:p>
+                </w:tc>
+                <w:tc>
+                  <w:tcPr>
+                    <w:tcW w:w="898" w:type="dxa"/>
+                  </w:tcPr>
+                  <w:p>
+                    <w:r>
+                      <w:rPr>
+                        <w:rFonts w:ascii="Times New Roman" w:hAnsi="Times New Roman"/>
+                        <w:sz w:val="20"/>
+                      </w:rPr>
+                      <w:t/>
+                    </w:r>
+                  </w:p>
+                </w:tc>
+                <w:tc>
+                  <w:tcPr>
+                    <w:tcW w:w="738" w:type="dxa"/>
+                  </w:tcPr>
+                  <w:p>
+                    <w:r>
+                      <w:rPr>
+                        <w:rFonts w:ascii="Times New Roman" w:hAnsi="Times New Roman"/>
+                        <w:sz w:val="20"/>
+                      </w:rPr>
+                      <w:t/>
+                    </w:r>
+                  </w:p>
+                </w:tc>
+                <w:tc>
+                  <w:tcPr>
+                    <w:tcW w:w="705" w:type="dxa"/>
+                  </w:tcPr>
+                  <w:p>
+                    <w:r>
+                      <w:rPr>
+                        <w:rFonts w:ascii="Times New Roman" w:hAnsi="Times New Roman"/>
+                        <w:sz w:val="20"/>
+                      </w:rPr>
+                      <w:t/>
+                    </w:r>
+                  </w:p>
+                </w:tc>
+                <w:tc>
+                  <w:tcPr>
+                    <w:tcW w:w="808" w:type="dxa"/>
+                  </w:tcPr>
+                  <w:p>
+                    <w:r>
+                      <w:rPr>
+                        <w:rFonts w:ascii="Times New Roman" w:hAnsi="Times New Roman"/>
+                        <w:sz w:val="20"/>
+                      </w:rPr>
+                      <w:t/>
+                    </w:r>
+                  </w:p>
+                </w:tc>
+                <w:tc>
+                  <w:tcPr>
+                    <w:tcW w:w="806" w:type="dxa"/>
+                  </w:tcPr>
+                  <w:p>
+                    <w:r>
+                      <w:rPr>
+                        <w:rFonts w:ascii="Times New Roman" w:hAnsi="Times New Roman"/>
+                        <w:sz w:val="20"/>
+                      </w:rPr>
+                      <w:t/>
+                    </w:r>
+                  </w:p>
+                </w:tc>
+              </w:tr>
+            </w:sdtContent>
+          </w:sdt>
+          <w:sdt>
+            <w:sdtPr>
+              <w:alias w:val="ifnot:HAS_SUPERIOR_ROWS"/>
+              <w:tag w:val="ifnot:HAS_SUPERIOR_ROWS"/>
+              <w:id w:val="921005"/>
+            </w:sdtPr>
+            <w:sdtContent>
+              <w:tr>
+                <w:tc>
+                  <w:tcPr>
+                    <w:tcW w:w="450" w:type="dxa"/>
+                  </w:tcPr>
+                  <w:p>
+                    <w:pPr>
+                      <w:jc w:val="center"/>
+                      <w:rPr>
+                        <w:sz w:val="20"/>
+                        <w:szCs w:val="20"/>
+                      </w:rPr>
+                    </w:pPr>
+                  </w:p>
+                </w:tc>
+                <w:tc>
+                  <w:tcPr>
+                    <w:tcW w:w="1435" w:type="dxa"/>
+                  </w:tcPr>
+                  <w:p>
+                    <w:pPr>
+                      <w:rPr>
+                        <w:sz w:val="20"/>
+                        <w:szCs w:val="20"/>
+                      </w:rPr>
+                    </w:pPr>
+                  </w:p>
+                </w:tc>
+                <w:tc>
+                  <w:tcPr>
+                    <w:tcW w:w="1719" w:type="dxa"/>
+                  </w:tcPr>
+                  <w:p>
+                    <w:pPr>
+                      <w:rPr>
+                        <w:sz w:val="20"/>
+                        <w:szCs w:val="20"/>
+                      </w:rPr>
+                    </w:pPr>
+                  </w:p>
+                </w:tc>
+                <w:tc>
+                  <w:tcPr>
+                    <w:tcW w:w="871" w:type="dxa"/>
+                  </w:tcPr>
+                  <w:p>
+                    <w:pPr>
+                      <w:jc w:val="center"/>
+                      <w:rPr>
+                        <w:sz w:val="20"/>
+                        <w:szCs w:val="20"/>
+                      </w:rPr>
+                    </w:pPr>
+                  </w:p>
+                </w:tc>
+                <w:tc>
+                  <w:tcPr>
+                    <w:tcW w:w="1324" w:type="dxa"/>
+                  </w:tcPr>
+                  <w:p>
+                    <w:pPr>
+                      <w:jc w:val="center"/>
+                      <w:rPr>
+                        <w:sz w:val="20"/>
+                        <w:szCs w:val="20"/>
+                      </w:rPr>
+                    </w:pPr>
+                  </w:p>
+                </w:tc>
+                <w:tc>
+                  <w:tcPr>
+                    <w:tcW w:w="774" w:type="dxa"/>
+                  </w:tcPr>
+                  <w:p>
+                    <w:pPr>
+                      <w:jc w:val="center"/>
+                      <w:rPr>
+                        <w:sz w:val="20"/>
+                        <w:szCs w:val="20"/>
+                      </w:rPr>
+                    </w:pPr>
+                  </w:p>
+                </w:tc>
+                <w:tc>
+                  <w:tcPr>
+                    <w:tcW w:w="728" w:type="dxa"/>
+                  </w:tcPr>
+                  <w:p>
+                    <w:pPr>
+                      <w:jc w:val="center"/>
+                      <w:rPr>
+                        <w:sz w:val="20"/>
+                        <w:szCs w:val="20"/>
+                      </w:rPr>
+                    </w:pPr>
+                  </w:p>
+                </w:tc>
+                <w:tc>
+                  <w:tcPr>
+                    <w:tcW w:w="2050" w:type="dxa"/>
+                  </w:tcPr>
+                  <w:p>
+                    <w:pPr>
+                      <w:jc w:val="center"/>
+                      <w:rPr>
+                        <w:sz w:val="20"/>
+                        <w:szCs w:val="20"/>
+                      </w:rPr>
+                    </w:pPr>
+                  </w:p>
+                </w:tc>
+                <w:tc>
+                  <w:tcPr>
+                    <w:tcW w:w="1276" w:type="dxa"/>
+                  </w:tcPr>
+                  <w:p>
+                    <w:pPr>
+                      <w:jc w:val="center"/>
+                      <w:rPr>
+                        <w:i/>
+                        <w:iCs/>
+                        <w:sz w:val="20"/>
+                        <w:szCs w:val="20"/>
+                      </w:rPr>
+                    </w:pPr>
+                  </w:p>
+                </w:tc>
+                <w:tc>
+                  <w:tcPr>
+                    <w:tcW w:w="898" w:type="dxa"/>
+                  </w:tcPr>
+                  <w:p>
+                    <w:pPr>
+                      <w:jc w:val="center"/>
+                      <w:rPr>
+                        <w:sz w:val="20"/>
+                        <w:szCs w:val="20"/>
+                      </w:rPr>
+                    </w:pPr>
+                  </w:p>
+                </w:tc>
+                <w:tc>
+                  <w:tcPr>
+                    <w:tcW w:w="738" w:type="dxa"/>
+                  </w:tcPr>
+                  <w:p>
+                    <w:pPr>
+                      <w:jc w:val="center"/>
+                      <w:rPr>
+                        <w:sz w:val="20"/>
+                        <w:szCs w:val="20"/>
+                      </w:rPr>
+                    </w:pPr>
+                  </w:p>
+                </w:tc>
+                <w:tc>
+                  <w:tcPr>
+                    <w:tcW w:w="705" w:type="dxa"/>
+                  </w:tcPr>
+                  <w:p>
+                    <w:pPr>
+                      <w:jc w:val="center"/>
+                      <w:rPr>
+                        <w:sz w:val="20"/>
+                        <w:szCs w:val="20"/>
+                      </w:rPr>
+                    </w:pPr>
+                  </w:p>
+                </w:tc>
+                <w:tc>
+                  <w:tcPr>
+                    <w:tcW w:w="808" w:type="dxa"/>
+                  </w:tcPr>
+                  <w:p>
+                    <w:pPr>
+                      <w:jc w:val="center"/>
+                      <w:rPr>
+                        <w:sz w:val="20"/>
+                        <w:szCs w:val="20"/>
+                      </w:rPr>
+                    </w:pPr>
+                  </w:p>
+                </w:tc>
+                <w:tc>
+                  <w:tcPr>
+                    <w:tcW w:w="806" w:type="dxa"/>
+                  </w:tcPr>
+                  <w:p>
+                    <w:pPr>
+                      <w:jc w:val="center"/>
+                      <w:rPr>
+                        <w:sz w:val="20"/>
+                        <w:szCs w:val="20"/>
+                      </w:rPr>
+                    </w:pPr>
+                  </w:p>
+                </w:tc>
+              </w:tr>
+            </w:sdtContent>
+          </w:sdt>
+        </w:sdtContent>
+      </w:sdt>
+      <w:sdt>
+        <w:sdtPr>
+          <w:alias w:val="if:SHOW_BASE"/>
+          <w:tag w:val="if:SHOW_BASE"/>
+          <w:id w:val="921009"/>
+        </w:sdtPr>
+        <w:sdtContent>
+          <w:tr>
+            <w:tc>
+              <w:tcPr>
+                <w:tcW w:w="450" w:type="dxa"/>
+              </w:tcPr>
+              <w:p>
+                <w:pPr>
+                  <w:jc w:val="center"/>
+                  <w:rPr>
+                    <w:b/>
+                    <w:bCs/>
+                    <w:sz w:val="20"/>
+                    <w:szCs w:val="20"/>
+                  </w:rPr>
+                </w:pPr>
+                <w:r>
+                  <w:rPr>
+                    <w:b/>
+                    <w:bCs/>
+                    <w:sz w:val="20"/>
+                    <w:szCs w:val="20"/>
+                  </w:rPr>
+                  <w:t>II</w:t>
+                </w:r>
+              </w:p>
+            </w:tc>
+            <w:tc>
+              <w:tcPr>
+                <w:tcW w:w="14133" w:type="dxa"/>
+                <w:gridSpan w:val="13"/>
+              </w:tcPr>
+              <w:p>
+                <w:pPr>
+                  <w:rPr>
+                    <w:b/>
+                    <w:bCs/>
+                    <w:sz w:val="20"/>
+                    <w:szCs w:val="20"/>
+                  </w:rPr>
+                </w:pPr>
+                <w:r>
+                  <w:rPr>
+                    <w:b/>
+                    <w:bCs/>
+                    <w:sz w:val="20"/>
+                    <w:szCs w:val="20"/>
+                  </w:rPr>
+                  <w:t xml:space="preserve">DANH SÁCH CÁN BỘ THUỘC THẨM QUYỀN QUYẾT ĐỊNH, PHÊ DUYỆT MỨC XẾP LOẠI CỦA </w:t>
+                </w:r>
+                <w:sdt>
+                  <w:sdtPr>
+                    <w:alias w:val="BASE_AUTHORITY"/>
+                    <w:tag w:val="BASE_AUTHORITY"/>
+                    <w:id w:val="921007"/>
+                  </w:sdtPr>
+                  <w:sdtContent>
+                    <w:r>
+                      <w:rPr>
+                        <w:b/>
+                        <w:bCs/>
+                        <w:sz w:val="20"/>
+                        <w:szCs w:val="20"/>
+                      </w:rPr>
+                      <w:t xml:space="preserve">ĐẢNG ỦY/CHI ỦY CƠ SỞ…</w:t>
                     </w:r>
                   </w:sdtContent>
                 </w:sdt>
               </w:p>
             </w:tc>
-            <w:tc>
-              <w:tcPr>
-                <w:tcW w:w="1435" w:type="dxa"/>
-              </w:tcPr>
-              <w:p>
-                <w:sdt>
-                  <w:sdtPr>
-                    <w:alias w:val="R_NAME"/>
-                    <w:tag w:val="R_NAME"/>
-                    <w:id w:val="510060"/>
-                  </w:sdtPr>
-                  <w:sdtContent>
+          </w:tr>
+          <w:sdt>
+            <w:sdtPr>
+              <w:alias w:val="repeat:BASE_ROWS"/>
+              <w:tag w:val="repeat:BASE_ROWS"/>
+              <w:id w:val="921003"/>
+            </w:sdtPr>
+            <w:sdtContent>
+              <w:tr>
+                <w:tc>
+                  <w:tcPr>
+                    <w:tcW w:w="450" w:type="dxa"/>
+                  </w:tcPr>
+                  <w:p>
+                    <w:sdt>
+                      <w:sdtPr>
+                        <w:alias w:val="R_STT"/>
+                        <w:tag w:val="R_STT"/>
+                        <w:id w:val="510059"/>
+                      </w:sdtPr>
+                      <w:sdtContent>
+                        <w:r>
+                          <w:rPr>
+                            <w:rFonts w:ascii="Times New Roman" w:hAnsi="Times New Roman"/>
+                            <w:sz w:val="20"/>
+                          </w:rPr>
+                          <w:t xml:space="preserve">«R_STT»</w:t>
+                        </w:r>
+                      </w:sdtContent>
+                    </w:sdt>
+                  </w:p>
+                </w:tc>
+                <w:tc>
+                  <w:tcPr>
+                    <w:tcW w:w="1435" w:type="dxa"/>
+                  </w:tcPr>
+                  <w:p>
+                    <w:sdt>
+                      <w:sdtPr>
+                        <w:alias w:val="R_NAME"/>
+                        <w:tag w:val="R_NAME"/>
+                        <w:id w:val="510060"/>
+                      </w:sdtPr>
+                      <w:sdtContent>
+                        <w:r>
+                          <w:rPr>
+                            <w:rFonts w:ascii="Times New Roman" w:hAnsi="Times New Roman"/>
+                            <w:sz w:val="20"/>
+                          </w:rPr>
+                          <w:t xml:space="preserve">«R_NAME»</w:t>
+                        </w:r>
+                      </w:sdtContent>
+                    </w:sdt>
+                  </w:p>
+                </w:tc>
+                <w:tc>
+                  <w:tcPr>
+                    <w:tcW w:w="1719" w:type="dxa"/>
+                  </w:tcPr>
+                  <w:p>
+                    <w:sdt>
+                      <w:sdtPr>
+                        <w:alias w:val="R_POSITION_DEPT"/>
+                        <w:tag w:val="R_POSITION_DEPT"/>
+                        <w:id w:val="510061"/>
+                      </w:sdtPr>
+                      <w:sdtContent>
+                        <w:r>
+                          <w:rPr>
+                            <w:rFonts w:ascii="Times New Roman" w:hAnsi="Times New Roman"/>
+                            <w:sz w:val="20"/>
+                          </w:rPr>
+                          <w:t xml:space="preserve">«R_POSITION_DEPT»</w:t>
+                        </w:r>
+                      </w:sdtContent>
+                    </w:sdt>
+                  </w:p>
+                </w:tc>
+                <w:tc>
+                  <w:tcPr>
+                    <w:tcW w:w="871" w:type="dxa"/>
+                  </w:tcPr>
+                  <w:p>
+                    <w:sdt>
+                      <w:sdtPr>
+                        <w:alias w:val="R_GENERAL_SCORE"/>
+                        <w:tag w:val="R_GENERAL_SCORE"/>
+                        <w:id w:val="510062"/>
+                      </w:sdtPr>
+                      <w:sdtContent>
+                        <w:r>
+                          <w:rPr>
+                            <w:rFonts w:ascii="Times New Roman" w:hAnsi="Times New Roman"/>
+                            <w:sz w:val="20"/>
+                          </w:rPr>
+                          <w:t xml:space="preserve">«R_GENERAL_SCORE»</w:t>
+                        </w:r>
+                      </w:sdtContent>
+                    </w:sdt>
+                  </w:p>
+                </w:tc>
+                <w:tc>
+                  <w:tcPr>
+                    <w:tcW w:w="1324" w:type="dxa"/>
+                  </w:tcPr>
+                  <w:p>
                     <w:r>
                       <w:rPr>
                         <w:rFonts w:ascii="Times New Roman" w:hAnsi="Times New Roman"/>
                         <w:sz w:val="20"/>
                       </w:rPr>
-                      <w:t xml:space="preserve">«R_NAME»</w:t>
+                      <w:t/>
                     </w:r>
-                  </w:sdtContent>
-                </w:sdt>
-              </w:p>
-            </w:tc>
-            <w:tc>
-              <w:tcPr>
-                <w:tcW w:w="1719" w:type="dxa"/>
-              </w:tcPr>
-              <w:p>
-                <w:sdt>
-                  <w:sdtPr>
-                    <w:alias w:val="R_POSITION_DEPT"/>
-                    <w:tag w:val="R_POSITION_DEPT"/>
-                    <w:id w:val="510061"/>
-                  </w:sdtPr>
-                  <w:sdtContent>
+                    <w:sdt>
+                      <w:sdtPr>
+                        <w:alias w:val="R_TASKS_SCORE"/>
+                        <w:tag w:val="R_TASKS_SCORE"/>
+                        <w:id w:val="510064"/>
+                      </w:sdtPr>
+                      <w:sdtContent>
+                        <w:r>
+                          <w:rPr>
+                            <w:rFonts w:ascii="Times New Roman" w:hAnsi="Times New Roman"/>
+                            <w:sz w:val="20"/>
+                          </w:rPr>
+                          <w:t xml:space="preserve">«R_TASKS_SCORE»</w:t>
+                        </w:r>
+                      </w:sdtContent>
+                    </w:sdt>
+                  </w:p>
+                </w:tc>
+                <w:tc>
+                  <w:tcPr>
+                    <w:tcW w:w="774" w:type="dxa"/>
+                  </w:tcPr>
+                  <w:p>
+                    <w:sdt>
+                      <w:sdtPr>
+                        <w:alias w:val="R_SELF_GRADE"/>
+                        <w:tag w:val="R_SELF_GRADE"/>
+                        <w:id w:val="510063"/>
+                      </w:sdtPr>
+                      <w:sdtContent>
+                        <w:r>
+                          <w:rPr>
+                            <w:rFonts w:ascii="Times New Roman" w:hAnsi="Times New Roman"/>
+                            <w:sz w:val="20"/>
+                          </w:rPr>
+                          <w:t xml:space="preserve">«R_SELF_GRADE»</w:t>
+                        </w:r>
+                      </w:sdtContent>
+                    </w:sdt>
+                  </w:p>
+                </w:tc>
+                <w:tc>
+                  <w:tcPr>
+                    <w:tcW w:w="728" w:type="dxa"/>
+                  </w:tcPr>
+                  <w:p>
+                    <w:sdt>
+                      <w:sdtPr>
+                        <w:alias w:val="R_COLLECTIVE_GRADE"/>
+                        <w:tag w:val="R_COLLECTIVE_GRADE"/>
+                        <w:id w:val="921000"/>
+                      </w:sdtPr>
+                      <w:sdtContent>
+                        <w:r>
+                          <w:rPr>
+                            <w:rFonts w:ascii="Times New Roman" w:hAnsi="Times New Roman"/>
+                            <w:sz w:val="20"/>
+                          </w:rPr>
+                          <w:t xml:space="preserve"/>
+                        </w:r>
+                      </w:sdtContent>
+                    </w:sdt>
+                  </w:p>
+                </w:tc>
+                <w:tc>
+                  <w:tcPr>
+                    <w:tcW w:w="2050" w:type="dxa"/>
+                  </w:tcPr>
+                  <w:p>
+                    <w:sdt>
+                      <w:sdtPr>
+                        <w:alias w:val="R_APPRAISAL_GRADE"/>
+                        <w:tag w:val="R_APPRAISAL_GRADE"/>
+                        <w:id w:val="921001"/>
+                      </w:sdtPr>
+                      <w:sdtContent>
+                        <w:r>
+                          <w:rPr>
+                            <w:rFonts w:ascii="Times New Roman" w:hAnsi="Times New Roman"/>
+                            <w:sz w:val="20"/>
+                          </w:rPr>
+                          <w:t xml:space="preserve"/>
+                        </w:r>
+                      </w:sdtContent>
+                    </w:sdt>
+                  </w:p>
+                </w:tc>
+                <w:tc>
+                  <w:tcPr>
+                    <w:tcW w:w="1276" w:type="dxa"/>
+                  </w:tcPr>
+                  <w:p>
+                    <w:sdt>
+                      <w:sdtPr>
+                        <w:alias w:val="R_DIRECTOR_GRADE"/>
+                        <w:tag w:val="R_DIRECTOR_GRADE"/>
+                        <w:id w:val="921002"/>
+                      </w:sdtPr>
+                      <w:sdtContent>
+                        <w:r>
+                          <w:rPr>
+                            <w:rFonts w:ascii="Times New Roman" w:hAnsi="Times New Roman"/>
+                            <w:sz w:val="20"/>
+                          </w:rPr>
+                          <w:t xml:space="preserve"/>
+                        </w:r>
+                      </w:sdtContent>
+                    </w:sdt>
+                  </w:p>
+                </w:tc>
+                <w:tc>
+                  <w:tcPr>
+                    <w:tcW w:w="898" w:type="dxa"/>
+                  </w:tcPr>
+                  <w:p>
                     <w:r>
                       <w:rPr>
                         <w:rFonts w:ascii="Times New Roman" w:hAnsi="Times New Roman"/>
                         <w:sz w:val="20"/>
                       </w:rPr>
-                      <w:t xml:space="preserve">«R_POSITION_DEPT»</w:t>
+                      <w:t/>
                     </w:r>
-                  </w:sdtContent>
-                </w:sdt>
-              </w:p>
-            </w:tc>
-            <w:tc>
-              <w:tcPr>
-                <w:tcW w:w="871" w:type="dxa"/>
-              </w:tcPr>
-              <w:p>
-                <w:sdt>
-                  <w:sdtPr>
-                    <w:alias w:val="R_GENERAL_SCORE"/>
-                    <w:tag w:val="R_GENERAL_SCORE"/>
-                    <w:id w:val="510062"/>
-                  </w:sdtPr>
-                  <w:sdtContent>
+                  </w:p>
+                </w:tc>
+                <w:tc>
+                  <w:tcPr>
+                    <w:tcW w:w="738" w:type="dxa"/>
+                  </w:tcPr>
+                  <w:p>
                     <w:r>
                       <w:rPr>
                         <w:rFonts w:ascii="Times New Roman" w:hAnsi="Times New Roman"/>
                         <w:sz w:val="20"/>
                       </w:rPr>
-                      <w:t xml:space="preserve">«R_GENERAL_SCORE»</w:t>
+                      <w:t/>
                     </w:r>
-                  </w:sdtContent>
-                </w:sdt>
-              </w:p>
-            </w:tc>
-            <w:tc>
-              <w:tcPr>
-                <w:tcW w:w="1324" w:type="dxa"/>
-              </w:tcPr>
-              <w:p>
-                <w:r>
-                  <w:rPr>
-                    <w:rFonts w:ascii="Times New Roman" w:hAnsi="Times New Roman"/>
-                    <w:sz w:val="20"/>
-                  </w:rPr>
-                  <w:t/>
-                </w:r>
-                <w:sdt>
-                  <w:sdtPr>
-                    <w:alias w:val="R_TASKS_SCORE"/>
-                    <w:tag w:val="R_TASKS_SCORE"/>
-                    <w:id w:val="510064"/>
-                  </w:sdtPr>
-                  <w:sdtContent>
+                  </w:p>
+                </w:tc>
+                <w:tc>
+                  <w:tcPr>
+                    <w:tcW w:w="705" w:type="dxa"/>
+                  </w:tcPr>
+                  <w:p>
                     <w:r>
                       <w:rPr>
                         <w:rFonts w:ascii="Times New Roman" w:hAnsi="Times New Roman"/>
                         <w:sz w:val="20"/>
                       </w:rPr>
-                      <w:t xml:space="preserve">«R_TASKS_SCORE»</w:t>
+                      <w:t/>
                     </w:r>
-                  </w:sdtContent>
-                </w:sdt>
-              </w:p>
-            </w:tc>
-            <w:tc>
-              <w:tcPr>
-                <w:tcW w:w="774" w:type="dxa"/>
-              </w:tcPr>
-              <w:p>
-                <w:sdt>
-                  <w:sdtPr>
-                    <w:alias w:val="R_SELF_GRADE"/>
-                    <w:tag w:val="R_SELF_GRADE"/>
-                    <w:id w:val="510063"/>
-                  </w:sdtPr>
-                  <w:sdtContent>
+                  </w:p>
+                </w:tc>
+                <w:tc>
+                  <w:tcPr>
+                    <w:tcW w:w="808" w:type="dxa"/>
+                  </w:tcPr>
+                  <w:p>
                     <w:r>
                       <w:rPr>
                         <w:rFonts w:ascii="Times New Roman" w:hAnsi="Times New Roman"/>
                         <w:sz w:val="20"/>
                       </w:rPr>
-                      <w:t xml:space="preserve">«R_SELF_GRADE»</w:t>
+                      <w:t/>
                     </w:r>
-                  </w:sdtContent>
-                </w:sdt>
-              </w:p>
-            </w:tc>
-            <w:tc>
-              <w:tcPr>
-                <w:tcW w:w="728" w:type="dxa"/>
-              </w:tcPr>
-              <w:p>
-                <w:r>
-                  <w:rPr>
-                    <w:rFonts w:ascii="Times New Roman" w:hAnsi="Times New Roman"/>
-                    <w:sz w:val="20"/>
-                  </w:rPr>
-                  <w:t/>
-                </w:r>
-              </w:p>
-            </w:tc>
-            <w:tc>
-              <w:tcPr>
-                <w:tcW w:w="2050" w:type="dxa"/>
-              </w:tcPr>
-              <w:p>
-                <w:r>
-                  <w:rPr>
-                    <w:rFonts w:ascii="Times New Roman" w:hAnsi="Times New Roman"/>
-                    <w:sz w:val="20"/>
-                  </w:rPr>
-                  <w:t/>
-                </w:r>
-              </w:p>
-            </w:tc>
-            <w:tc>
-              <w:tcPr>
-                <w:tcW w:w="1276" w:type="dxa"/>
-              </w:tcPr>
-              <w:p>
-                <w:r>
-                  <w:rPr>
-                    <w:rFonts w:ascii="Times New Roman" w:hAnsi="Times New Roman"/>
-                    <w:sz w:val="20"/>
-                  </w:rPr>
-                  <w:t/>
-                </w:r>
-              </w:p>
-            </w:tc>
-            <w:tc>
-              <w:tcPr>
-                <w:tcW w:w="898" w:type="dxa"/>
-              </w:tcPr>
-              <w:p>
-                <w:r>
-                  <w:rPr>
-                    <w:rFonts w:ascii="Times New Roman" w:hAnsi="Times New Roman"/>
-                    <w:sz w:val="20"/>
-                  </w:rPr>
-                  <w:t/>
-                </w:r>
-              </w:p>
-            </w:tc>
-            <w:tc>
-              <w:tcPr>
-                <w:tcW w:w="738" w:type="dxa"/>
-              </w:tcPr>
-              <w:p>
-                <w:r>
-                  <w:rPr>
-                    <w:rFonts w:ascii="Times New Roman" w:hAnsi="Times New Roman"/>
-                    <w:sz w:val="20"/>
-                  </w:rPr>
-                  <w:t/>
-                </w:r>
-              </w:p>
-            </w:tc>
-            <w:tc>
-              <w:tcPr>
-                <w:tcW w:w="705" w:type="dxa"/>
-              </w:tcPr>
-              <w:p>
-                <w:r>
-                  <w:rPr>
-                    <w:rFonts w:ascii="Times New Roman" w:hAnsi="Times New Roman"/>
-                    <w:sz w:val="20"/>
-                  </w:rPr>
-                  <w:t/>
-                </w:r>
-              </w:p>
-            </w:tc>
-            <w:tc>
-              <w:tcPr>
-                <w:tcW w:w="808" w:type="dxa"/>
-              </w:tcPr>
-              <w:p>
-                <w:r>
-                  <w:rPr>
-                    <w:rFonts w:ascii="Times New Roman" w:hAnsi="Times New Roman"/>
-                    <w:sz w:val="20"/>
-                  </w:rPr>
-                  <w:t/>
-                </w:r>
-              </w:p>
-            </w:tc>
-            <w:tc>
-              <w:tcPr>
-                <w:tcW w:w="806" w:type="dxa"/>
-              </w:tcPr>
-              <w:p>
-                <w:r>
-                  <w:rPr>
-                    <w:rFonts w:ascii="Times New Roman" w:hAnsi="Times New Roman"/>
-                    <w:sz w:val="20"/>
-                  </w:rPr>
-                  <w:t/>
-                </w:r>
-              </w:p>
-            </w:tc>
-          </w:tr>
+                  </w:p>
+                </w:tc>
+                <w:tc>
+                  <w:tcPr>
+                    <w:tcW w:w="806" w:type="dxa"/>
+                  </w:tcPr>
+                  <w:p>
+                    <w:r>
+                      <w:rPr>
+                        <w:rFonts w:ascii="Times New Roman" w:hAnsi="Times New Roman"/>
+                        <w:sz w:val="20"/>
+                      </w:rPr>
+                      <w:t/>
+                    </w:r>
+                  </w:p>
+                </w:tc>
+              </w:tr>
+            </w:sdtContent>
+          </w:sdt>
+          <w:sdt>
+            <w:sdtPr>
+              <w:alias w:val="ifnot:HAS_BASE_ROWS"/>
+              <w:tag w:val="ifnot:HAS_BASE_ROWS"/>
+              <w:id w:val="921006"/>
+            </w:sdtPr>
+            <w:sdtContent>
+              <w:tr>
+                <w:tc>
+                  <w:tcPr>
+                    <w:tcW w:w="450" w:type="dxa"/>
+                  </w:tcPr>
+                  <w:p>
+                    <w:pPr>
+                      <w:jc w:val="center"/>
+                      <w:rPr>
+                        <w:sz w:val="20"/>
+                        <w:szCs w:val="20"/>
+                      </w:rPr>
+                    </w:pPr>
+                  </w:p>
+                </w:tc>
+                <w:tc>
+                  <w:tcPr>
+                    <w:tcW w:w="1435" w:type="dxa"/>
+                  </w:tcPr>
+                  <w:p>
+                    <w:pPr>
+                      <w:rPr>
+                        <w:sz w:val="20"/>
+                        <w:szCs w:val="20"/>
+                      </w:rPr>
+                    </w:pPr>
+                  </w:p>
+                </w:tc>
+                <w:tc>
+                  <w:tcPr>
+                    <w:tcW w:w="1719" w:type="dxa"/>
+                  </w:tcPr>
+                  <w:p>
+                    <w:pPr>
+                      <w:rPr>
+                        <w:sz w:val="20"/>
+                        <w:szCs w:val="20"/>
+                      </w:rPr>
+                    </w:pPr>
+                  </w:p>
+                </w:tc>
+                <w:tc>
+                  <w:tcPr>
+                    <w:tcW w:w="871" w:type="dxa"/>
+                  </w:tcPr>
+                  <w:p>
+                    <w:pPr>
+                      <w:jc w:val="center"/>
+                      <w:rPr>
+                        <w:sz w:val="20"/>
+                        <w:szCs w:val="20"/>
+                      </w:rPr>
+                    </w:pPr>
+                  </w:p>
+                </w:tc>
+                <w:tc>
+                  <w:tcPr>
+                    <w:tcW w:w="1324" w:type="dxa"/>
+                  </w:tcPr>
+                  <w:p>
+                    <w:pPr>
+                      <w:jc w:val="center"/>
+                      <w:rPr>
+                        <w:sz w:val="20"/>
+                        <w:szCs w:val="20"/>
+                      </w:rPr>
+                    </w:pPr>
+                  </w:p>
+                </w:tc>
+                <w:tc>
+                  <w:tcPr>
+                    <w:tcW w:w="774" w:type="dxa"/>
+                  </w:tcPr>
+                  <w:p>
+                    <w:pPr>
+                      <w:jc w:val="center"/>
+                      <w:rPr>
+                        <w:sz w:val="20"/>
+                        <w:szCs w:val="20"/>
+                      </w:rPr>
+                    </w:pPr>
+                  </w:p>
+                </w:tc>
+                <w:tc>
+                  <w:tcPr>
+                    <w:tcW w:w="728" w:type="dxa"/>
+                  </w:tcPr>
+                  <w:p>
+                    <w:pPr>
+                      <w:jc w:val="center"/>
+                      <w:rPr>
+                        <w:sz w:val="20"/>
+                        <w:szCs w:val="20"/>
+                      </w:rPr>
+                    </w:pPr>
+                  </w:p>
+                </w:tc>
+                <w:tc>
+                  <w:tcPr>
+                    <w:tcW w:w="2050" w:type="dxa"/>
+                  </w:tcPr>
+                  <w:p>
+                    <w:pPr>
+                      <w:jc w:val="center"/>
+                      <w:rPr>
+                        <w:sz w:val="20"/>
+                        <w:szCs w:val="20"/>
+                      </w:rPr>
+                    </w:pPr>
+                  </w:p>
+                </w:tc>
+                <w:tc>
+                  <w:tcPr>
+                    <w:tcW w:w="1276" w:type="dxa"/>
+                  </w:tcPr>
+                  <w:p>
+                    <w:pPr>
+                      <w:jc w:val="center"/>
+                      <w:rPr>
+                        <w:i/>
+                        <w:iCs/>
+                        <w:sz w:val="20"/>
+                        <w:szCs w:val="20"/>
+                      </w:rPr>
+                    </w:pPr>
+                  </w:p>
+                </w:tc>
+                <w:tc>
+                  <w:tcPr>
+                    <w:tcW w:w="898" w:type="dxa"/>
+                  </w:tcPr>
+                  <w:p>
+                    <w:pPr>
+                      <w:jc w:val="center"/>
+                      <w:rPr>
+                        <w:sz w:val="20"/>
+                        <w:szCs w:val="20"/>
+                      </w:rPr>
+                    </w:pPr>
+                  </w:p>
+                </w:tc>
+                <w:tc>
+                  <w:tcPr>
+                    <w:tcW w:w="738" w:type="dxa"/>
+                  </w:tcPr>
+                  <w:p>
+                    <w:pPr>
+                      <w:jc w:val="center"/>
+                      <w:rPr>
+                        <w:sz w:val="20"/>
+                        <w:szCs w:val="20"/>
+                      </w:rPr>
+                    </w:pPr>
+                  </w:p>
+                </w:tc>
+                <w:tc>
+                  <w:tcPr>
+                    <w:tcW w:w="705" w:type="dxa"/>
+                  </w:tcPr>
+                  <w:p>
+                    <w:pPr>
+                      <w:jc w:val="center"/>
+                      <w:rPr>
+                        <w:sz w:val="20"/>
+                        <w:szCs w:val="20"/>
+                      </w:rPr>
+                    </w:pPr>
+                  </w:p>
+                </w:tc>
+                <w:tc>
+                  <w:tcPr>
+                    <w:tcW w:w="808" w:type="dxa"/>
+                  </w:tcPr>
+                  <w:p>
+                    <w:pPr>
+                      <w:jc w:val="center"/>
+                      <w:rPr>
+                        <w:sz w:val="20"/>
+                        <w:szCs w:val="20"/>
+                      </w:rPr>
+                    </w:pPr>
+                  </w:p>
+                </w:tc>
+                <w:tc>
+                  <w:tcPr>
+                    <w:tcW w:w="806" w:type="dxa"/>
+                  </w:tcPr>
+                  <w:p>
+                    <w:pPr>
+                      <w:jc w:val="center"/>
+                      <w:rPr>
+                        <w:sz w:val="20"/>
+                        <w:szCs w:val="20"/>
+                      </w:rPr>
+                    </w:pPr>
+                  </w:p>
+                </w:tc>
+              </w:tr>
+            </w:sdtContent>
+          </w:sdt>
         </w:sdtContent>
       </w:sdt>
     </w:tbl>

</xml_diff>